<commit_message>
Made changes in the document of the project !
</commit_message>
<xml_diff>
--- a/BrainTumor_Segmentation_Documentation.docx
+++ b/BrainTumor_Segmentation_Documentation.docx
@@ -1,6 +1,6 @@
 
 <file path=word/document.xml><?xml version="1.0" encoding="utf-8"?>
-<w:document xmlns:wpc="http://schemas.microsoft.com/office/word/2010/wordprocessingCanvas" xmlns:cx="http://schemas.microsoft.com/office/drawing/2014/chartex" xmlns:cx1="http://schemas.microsoft.com/office/drawing/2015/9/8/chartex" xmlns:cx2="http://schemas.microsoft.com/office/drawing/2015/10/21/chartex" xmlns:cx3="http://schemas.microsoft.com/office/drawing/2016/5/9/chartex" xmlns:cx4="http://schemas.microsoft.com/office/drawing/2016/5/10/chartex" xmlns:cx5="http://schemas.microsoft.com/office/drawing/2016/5/11/chartex" xmlns:cx6="http://schemas.microsoft.com/office/drawing/2016/5/12/chartex" xmlns:cx7="http://schemas.microsoft.com/office/drawing/2016/5/13/chartex" xmlns:cx8="http://schemas.microsoft.com/office/drawing/2016/5/14/chartex" xmlns:mc="http://schemas.openxmlformats.org/markup-compatibility/2006" xmlns:aink="http://schemas.microsoft.com/office/drawing/2016/ink" xmlns:am3d="http://schemas.microsoft.com/office/drawing/2017/model3d" xmlns:o="urn:schemas-microsoft-com:office:office" xmlns:oel="http://schemas.microsoft.com/office/2019/extlst" xmlns:r="http://schemas.openxmlformats.org/officeDocument/2006/relationships" xmlns:m="http://schemas.openxmlformats.org/officeDocument/2006/math" xmlns:v="urn:schemas-microsoft-com:vml" xmlns:wp14="http://schemas.microsoft.com/office/word/2010/wordprocessingDrawing" xmlns:wp="http://schemas.openxmlformats.org/drawingml/2006/wordprocessingDrawing" xmlns:w10="urn:schemas-microsoft-com:office:word" xmlns:w="http://schemas.openxmlformats.org/wordprocessingml/2006/main" xmlns:w14="http://schemas.microsoft.com/office/word/2010/wordml" xmlns:w15="http://schemas.microsoft.com/office/word/2012/wordml" xmlns:w16cex="http://schemas.microsoft.com/office/word/2018/wordml/cex" xmlns:w16cid="http://schemas.microsoft.com/office/word/2016/wordml/cid" xmlns:w16="http://schemas.microsoft.com/office/word/2018/wordml" xmlns:w16du="http://schemas.microsoft.com/office/word/2023/wordml/word16du" xmlns:w16sdtdh="http://schemas.microsoft.com/office/word/2020/wordml/sdtdatahash" xmlns:w16sdtfl="http://schemas.microsoft.com/office/word/2024/wordml/sdtformatlock" xmlns:w16se="http://schemas.microsoft.com/office/word/2015/wordml/symex" xmlns:wpg="http://schemas.microsoft.com/office/word/2010/wordprocessingGroup" xmlns:wpi="http://schemas.microsoft.com/office/word/2010/wordprocessingInk" xmlns:wne="http://schemas.microsoft.com/office/word/2006/wordml" xmlns:wps="http://schemas.microsoft.com/office/word/2010/wordprocessingShape" mc:Ignorable="w14 w15 w16se w16cid w16 w16cex w16sdtdh w16sdtfl w16du wp14">
+<w:document xmlns:wpc="http://schemas.microsoft.com/office/word/2010/wordprocessingCanvas" xmlns:cx="http://schemas.microsoft.com/office/drawing/2014/chartex" xmlns:cx1="http://schemas.microsoft.com/office/drawing/2015/9/8/chartex" xmlns:cx2="http://schemas.microsoft.com/office/drawing/2015/10/21/chartex" xmlns:cx3="http://schemas.microsoft.com/office/drawing/2016/5/9/chartex" xmlns:cx4="http://schemas.microsoft.com/office/drawing/2016/5/10/chartex" xmlns:cx5="http://schemas.microsoft.com/office/drawing/2016/5/11/chartex" xmlns:cx6="http://schemas.microsoft.com/office/drawing/2016/5/12/chartex" xmlns:cx7="http://schemas.microsoft.com/office/drawing/2016/5/13/chartex" xmlns:cx8="http://schemas.microsoft.com/office/drawing/2016/5/14/chartex" xmlns:mc="http://schemas.openxmlformats.org/markup-compatibility/2006" xmlns:aink="http://schemas.microsoft.com/office/drawing/2016/ink" xmlns:am3d="http://schemas.microsoft.com/office/drawing/2017/model3d" xmlns:o="urn:schemas-microsoft-com:office:office" xmlns:r="http://schemas.openxmlformats.org/officeDocument/2006/relationships" xmlns:m="http://schemas.openxmlformats.org/officeDocument/2006/math" xmlns:v="urn:schemas-microsoft-com:vml" xmlns:wp14="http://schemas.microsoft.com/office/word/2010/wordprocessingDrawing" xmlns:wp="http://schemas.openxmlformats.org/drawingml/2006/wordprocessingDrawing" xmlns:w10="urn:schemas-microsoft-com:office:word" xmlns:w="http://schemas.openxmlformats.org/wordprocessingml/2006/main" xmlns:w14="http://schemas.microsoft.com/office/word/2010/wordml" xmlns:w15="http://schemas.microsoft.com/office/word/2012/wordml" xmlns:w16cid="http://schemas.microsoft.com/office/word/2016/wordml/cid" xmlns:w16se="http://schemas.microsoft.com/office/word/2015/wordml/symex" xmlns:wpg="http://schemas.microsoft.com/office/word/2010/wordprocessingGroup" xmlns:wpi="http://schemas.microsoft.com/office/word/2010/wordprocessingInk" xmlns:wne="http://schemas.microsoft.com/office/word/2006/wordml" xmlns:wps="http://schemas.microsoft.com/office/word/2010/wordprocessingShape" mc:Ignorable="w14 w15 w16se w16cid wp14">
   <w:body>
     <w:p>
       <w:pPr>
@@ -167,48 +167,28 @@
           <w:sz w:val="32"/>
           <w:szCs w:val="32"/>
         </w:rPr>
-        <w:t>et Information</w:t>
-      </w:r>
-      <w:r>
-        <w:rPr>
-          <w:rFonts w:ascii="Times New Roman" w:hAnsi="Times New Roman" w:cs="Times New Roman"/>
-          <w:b/>
-          <w:bCs/>
-          <w:sz w:val="32"/>
-          <w:szCs w:val="32"/>
-        </w:rPr>
-        <w:t>:</w:t>
-      </w:r>
-    </w:p>
-    <w:p>
-      <w:pPr>
-        <w:rPr>
-          <w:rFonts w:ascii="Times New Roman" w:hAnsi="Times New Roman" w:cs="Times New Roman"/>
-          <w:b/>
-          <w:bCs/>
-          <w:sz w:val="28"/>
-          <w:szCs w:val="28"/>
-        </w:rPr>
-      </w:pPr>
-      <w:r>
-        <w:rPr>
-          <w:rFonts w:ascii="Times New Roman" w:hAnsi="Times New Roman" w:cs="Times New Roman"/>
-          <w:b/>
-          <w:bCs/>
-          <w:sz w:val="28"/>
-          <w:szCs w:val="28"/>
-        </w:rPr>
-        <w:t>Dataset Link:</w:t>
-      </w:r>
-      <w:r>
-        <w:rPr>
-          <w:rFonts w:ascii="Times New Roman" w:hAnsi="Times New Roman" w:cs="Times New Roman"/>
-          <w:b/>
-          <w:bCs/>
-          <w:sz w:val="28"/>
-          <w:szCs w:val="28"/>
-        </w:rPr>
-        <w:t xml:space="preserve"> </w:t>
+        <w:t>et Information:</w:t>
+      </w:r>
+    </w:p>
+    <w:p>
+      <w:pPr>
+        <w:rPr>
+          <w:rFonts w:ascii="Times New Roman" w:hAnsi="Times New Roman" w:cs="Times New Roman"/>
+          <w:b/>
+          <w:bCs/>
+          <w:sz w:val="28"/>
+          <w:szCs w:val="28"/>
+        </w:rPr>
+      </w:pPr>
+      <w:r>
+        <w:rPr>
+          <w:rFonts w:ascii="Times New Roman" w:hAnsi="Times New Roman" w:cs="Times New Roman"/>
+          <w:b/>
+          <w:bCs/>
+          <w:sz w:val="28"/>
+          <w:szCs w:val="28"/>
+        </w:rPr>
+        <w:t xml:space="preserve">Dataset Link: </w:t>
       </w:r>
       <w:hyperlink r:id="rId5" w:history="1">
         <w:r>
@@ -1309,9 +1289,111 @@
           <w:sz w:val="32"/>
           <w:szCs w:val="32"/>
         </w:rPr>
-        <w:t>Custom Data Generator</w:t>
-      </w:r>
-      <w:r>
+        <w:t>Custom Data Generator:</w:t>
+      </w:r>
+    </w:p>
+    <w:p>
+      <w:pPr>
+        <w:rPr>
+          <w:rFonts w:ascii="Times New Roman" w:hAnsi="Times New Roman" w:cs="Times New Roman"/>
+          <w:sz w:val="28"/>
+          <w:szCs w:val="28"/>
+        </w:rPr>
+      </w:pPr>
+      <w:r>
+        <w:rPr>
+          <w:rFonts w:ascii="Times New Roman" w:hAnsi="Times New Roman" w:cs="Times New Roman"/>
+          <w:sz w:val="28"/>
+          <w:szCs w:val="28"/>
+        </w:rPr>
+        <w:t>Why custom data generator?</w:t>
+      </w:r>
+      <w:r>
+        <w:rPr>
+          <w:rFonts w:ascii="Times New Roman" w:hAnsi="Times New Roman" w:cs="Times New Roman"/>
+          <w:sz w:val="28"/>
+          <w:szCs w:val="28"/>
+        </w:rPr>
+        <w:br/>
+        <w:t>Default Keras data generator doesn't handle the npy</w:t>
+      </w:r>
+      <w:r>
+        <w:rPr>
+          <w:rFonts w:ascii="Times New Roman" w:hAnsi="Times New Roman" w:cs="Times New Roman"/>
+          <w:sz w:val="28"/>
+          <w:szCs w:val="28"/>
+        </w:rPr>
+        <w:t xml:space="preserve"> </w:t>
+      </w:r>
+      <w:r>
+        <w:rPr>
+          <w:rFonts w:ascii="Times New Roman" w:hAnsi="Times New Roman" w:cs="Times New Roman"/>
+          <w:sz w:val="28"/>
+          <w:szCs w:val="28"/>
+        </w:rPr>
+        <w:t>arrays. And we are handling the npy arrays. So</w:t>
+      </w:r>
+      <w:r>
+        <w:rPr>
+          <w:rFonts w:ascii="Times New Roman" w:hAnsi="Times New Roman" w:cs="Times New Roman"/>
+          <w:sz w:val="28"/>
+          <w:szCs w:val="28"/>
+        </w:rPr>
+        <w:t xml:space="preserve">, </w:t>
+      </w:r>
+      <w:r>
+        <w:rPr>
+          <w:rFonts w:ascii="Times New Roman" w:hAnsi="Times New Roman" w:cs="Times New Roman"/>
+          <w:sz w:val="28"/>
+          <w:szCs w:val="28"/>
+        </w:rPr>
+        <w:t>we are creating a custom data generator that loads the data into the model for training.</w:t>
+      </w:r>
+    </w:p>
+    <w:p>
+      <w:pPr>
+        <w:rPr>
+          <w:rFonts w:ascii="Times New Roman" w:hAnsi="Times New Roman" w:cs="Times New Roman"/>
+          <w:sz w:val="28"/>
+          <w:szCs w:val="28"/>
+        </w:rPr>
+      </w:pPr>
+      <w:r>
+        <w:rPr>
+          <w:rFonts w:ascii="Times New Roman" w:hAnsi="Times New Roman" w:cs="Times New Roman"/>
+          <w:sz w:val="28"/>
+          <w:szCs w:val="28"/>
+        </w:rPr>
+        <w:t>So</w:t>
+      </w:r>
+      <w:r>
+        <w:rPr>
+          <w:rFonts w:ascii="Times New Roman" w:hAnsi="Times New Roman" w:cs="Times New Roman"/>
+          <w:sz w:val="28"/>
+          <w:szCs w:val="28"/>
+        </w:rPr>
+        <w:t>,</w:t>
+      </w:r>
+      <w:r>
+        <w:rPr>
+          <w:rFonts w:ascii="Times New Roman" w:hAnsi="Times New Roman" w:cs="Times New Roman"/>
+          <w:sz w:val="28"/>
+          <w:szCs w:val="28"/>
+        </w:rPr>
+        <w:t xml:space="preserve"> at the end, the custom data generator will help you yield a set of batches for training and each batch contains (an image, respective mask). The structure of the batch would be [(1, height, width, channels), (1, height, width, channels)] [if batch_size=1, and in the shape, 1 represents the batch size].</w:t>
+      </w:r>
+    </w:p>
+    <w:p>
+      <w:pPr>
+        <w:rPr>
+          <w:rFonts w:ascii="Times New Roman" w:hAnsi="Times New Roman" w:cs="Times New Roman"/>
+          <w:sz w:val="28"/>
+          <w:szCs w:val="28"/>
+        </w:rPr>
+      </w:pPr>
+    </w:p>
+    <w:p>
+      <w:pPr>
         <w:rPr>
           <w:rFonts w:ascii="Times New Roman" w:hAnsi="Times New Roman" w:cs="Times New Roman"/>
           <w:b/>
@@ -1319,111 +1401,8 @@
           <w:sz w:val="32"/>
           <w:szCs w:val="32"/>
         </w:rPr>
-        <w:t>:</w:t>
-      </w:r>
-    </w:p>
-    <w:p>
-      <w:pPr>
-        <w:rPr>
-          <w:rFonts w:ascii="Times New Roman" w:hAnsi="Times New Roman" w:cs="Times New Roman"/>
-          <w:sz w:val="28"/>
-          <w:szCs w:val="28"/>
-        </w:rPr>
-      </w:pPr>
-      <w:r>
-        <w:rPr>
-          <w:rFonts w:ascii="Times New Roman" w:hAnsi="Times New Roman" w:cs="Times New Roman"/>
-          <w:sz w:val="28"/>
-          <w:szCs w:val="28"/>
-        </w:rPr>
-        <w:t>Why custom data generator?</w:t>
-      </w:r>
-      <w:r>
-        <w:rPr>
-          <w:rFonts w:ascii="Times New Roman" w:hAnsi="Times New Roman" w:cs="Times New Roman"/>
-          <w:sz w:val="28"/>
-          <w:szCs w:val="28"/>
-        </w:rPr>
-        <w:br/>
-        <w:t>Default Keras data generator doesn't handle the npy</w:t>
-      </w:r>
-      <w:r>
-        <w:rPr>
-          <w:rFonts w:ascii="Times New Roman" w:hAnsi="Times New Roman" w:cs="Times New Roman"/>
-          <w:sz w:val="28"/>
-          <w:szCs w:val="28"/>
-        </w:rPr>
-        <w:t xml:space="preserve"> </w:t>
-      </w:r>
-      <w:r>
-        <w:rPr>
-          <w:rFonts w:ascii="Times New Roman" w:hAnsi="Times New Roman" w:cs="Times New Roman"/>
-          <w:sz w:val="28"/>
-          <w:szCs w:val="28"/>
-        </w:rPr>
-        <w:t>arrays. And we are handling the npy arrays. So</w:t>
-      </w:r>
-      <w:r>
-        <w:rPr>
-          <w:rFonts w:ascii="Times New Roman" w:hAnsi="Times New Roman" w:cs="Times New Roman"/>
-          <w:sz w:val="28"/>
-          <w:szCs w:val="28"/>
-        </w:rPr>
-        <w:t xml:space="preserve">, </w:t>
-      </w:r>
-      <w:r>
-        <w:rPr>
-          <w:rFonts w:ascii="Times New Roman" w:hAnsi="Times New Roman" w:cs="Times New Roman"/>
-          <w:sz w:val="28"/>
-          <w:szCs w:val="28"/>
-        </w:rPr>
-        <w:t>we are creating a custom data generator that loads the data into the model for training.</w:t>
-      </w:r>
-    </w:p>
-    <w:p>
-      <w:pPr>
-        <w:rPr>
-          <w:rFonts w:ascii="Times New Roman" w:hAnsi="Times New Roman" w:cs="Times New Roman"/>
-          <w:sz w:val="28"/>
-          <w:szCs w:val="28"/>
-        </w:rPr>
-      </w:pPr>
-      <w:r>
-        <w:rPr>
-          <w:rFonts w:ascii="Times New Roman" w:hAnsi="Times New Roman" w:cs="Times New Roman"/>
-          <w:sz w:val="28"/>
-          <w:szCs w:val="28"/>
-        </w:rPr>
-        <w:t>So</w:t>
-      </w:r>
-      <w:r>
-        <w:rPr>
-          <w:rFonts w:ascii="Times New Roman" w:hAnsi="Times New Roman" w:cs="Times New Roman"/>
-          <w:sz w:val="28"/>
-          <w:szCs w:val="28"/>
-        </w:rPr>
-        <w:t>,</w:t>
-      </w:r>
-      <w:r>
-        <w:rPr>
-          <w:rFonts w:ascii="Times New Roman" w:hAnsi="Times New Roman" w:cs="Times New Roman"/>
-          <w:sz w:val="28"/>
-          <w:szCs w:val="28"/>
-        </w:rPr>
-        <w:t xml:space="preserve"> at the end, the custom data generator will help you yield a set of batches for training and each batch contains (an image, respective mask). The structure of the batch would be [(1, height, width, channels), (1, height, width, channels)] [if batch_size=1, and in the shape, 1 represents the batch size].</w:t>
-      </w:r>
-    </w:p>
-    <w:p>
-      <w:pPr>
-        <w:rPr>
-          <w:rFonts w:ascii="Times New Roman" w:hAnsi="Times New Roman" w:cs="Times New Roman"/>
-          <w:sz w:val="28"/>
-          <w:szCs w:val="28"/>
-        </w:rPr>
-      </w:pPr>
-    </w:p>
-    <w:p>
-      <w:pPr>
+      </w:pPr>
+      <w:r>
         <w:rPr>
           <w:rFonts w:ascii="Times New Roman" w:hAnsi="Times New Roman" w:cs="Times New Roman"/>
           <w:b/>
@@ -1431,26 +1410,7 @@
           <w:sz w:val="32"/>
           <w:szCs w:val="32"/>
         </w:rPr>
-      </w:pPr>
-      <w:r>
-        <w:rPr>
-          <w:rFonts w:ascii="Times New Roman" w:hAnsi="Times New Roman" w:cs="Times New Roman"/>
-          <w:b/>
-          <w:bCs/>
-          <w:sz w:val="32"/>
-          <w:szCs w:val="32"/>
-        </w:rPr>
-        <w:t>Visualization of the Inputs</w:t>
-      </w:r>
-      <w:r>
-        <w:rPr>
-          <w:rFonts w:ascii="Times New Roman" w:hAnsi="Times New Roman" w:cs="Times New Roman"/>
-          <w:b/>
-          <w:bCs/>
-          <w:sz w:val="32"/>
-          <w:szCs w:val="32"/>
-        </w:rPr>
-        <w:t>:</w:t>
+        <w:t>Visualization of the Inputs:</w:t>
       </w:r>
     </w:p>
     <w:p>
@@ -2000,12 +1960,88 @@
       </w:pPr>
       <w:r>
         <w:rPr>
-          <w:rFonts w:ascii="Times New Roman" w:hAnsi="Times New Roman" w:cs="Times New Roman"/>
-          <w:b/>
-          <w:bCs/>
-          <w:sz w:val="28"/>
-          <w:szCs w:val="28"/>
-        </w:rPr>
+          <w:rStyle w:val="Strong"/>
+          <w:rFonts w:ascii="Times New Roman" w:hAnsi="Times New Roman" w:cs="Times New Roman"/>
+          <w:sz w:val="28"/>
+          <w:szCs w:val="28"/>
+        </w:rPr>
+        <w:t>IOU (Intersection over Union)</w:t>
+      </w:r>
+      <w:r>
+        <w:rPr>
+          <w:rFonts w:ascii="Times New Roman" w:hAnsi="Times New Roman" w:cs="Times New Roman"/>
+          <w:sz w:val="28"/>
+          <w:szCs w:val="28"/>
+        </w:rPr>
+        <w:t xml:space="preserve"> and </w:t>
+      </w:r>
+      <w:r>
+        <w:rPr>
+          <w:rStyle w:val="Strong"/>
+          <w:rFonts w:ascii="Times New Roman" w:hAnsi="Times New Roman" w:cs="Times New Roman"/>
+          <w:sz w:val="28"/>
+          <w:szCs w:val="28"/>
+        </w:rPr>
+        <w:t>Dice Loss</w:t>
+      </w:r>
+      <w:r>
+        <w:rPr>
+          <w:rFonts w:ascii="Times New Roman" w:hAnsi="Times New Roman" w:cs="Times New Roman"/>
+          <w:sz w:val="28"/>
+          <w:szCs w:val="28"/>
+        </w:rPr>
+        <w:t xml:space="preserve"> are both used to evaluate segmentation models</w:t>
+      </w:r>
+      <w:r>
+        <w:rPr>
+          <w:rFonts w:ascii="Times New Roman" w:hAnsi="Times New Roman" w:cs="Times New Roman"/>
+          <w:sz w:val="28"/>
+          <w:szCs w:val="28"/>
+        </w:rPr>
+        <w:t xml:space="preserve">. Dice is used to handle class imbalance where foreground &lt; </w:t>
+      </w:r>
+      <w:proofErr w:type="gramStart"/>
+      <w:r>
+        <w:rPr>
+          <w:rFonts w:ascii="Times New Roman" w:hAnsi="Times New Roman" w:cs="Times New Roman"/>
+          <w:sz w:val="28"/>
+          <w:szCs w:val="28"/>
+        </w:rPr>
+        <w:t>background .</w:t>
+      </w:r>
+      <w:proofErr w:type="gramEnd"/>
+      <w:r>
+        <w:rPr>
+          <w:rFonts w:ascii="Times New Roman" w:hAnsi="Times New Roman" w:cs="Times New Roman"/>
+          <w:sz w:val="28"/>
+          <w:szCs w:val="28"/>
+        </w:rPr>
+        <w:t xml:space="preserve"> IOU is used to have precise boundary overlap while segmenting.</w:t>
+      </w:r>
+      <w:bookmarkStart w:id="0" w:name="_GoBack"/>
+      <w:bookmarkEnd w:id="0"/>
+    </w:p>
+    <w:p>
+      <w:pPr>
+        <w:numPr>
+          <w:ilvl w:val="0"/>
+          <w:numId w:val="5"/>
+        </w:numPr>
+        <w:rPr>
+          <w:rFonts w:ascii="Times New Roman" w:hAnsi="Times New Roman" w:cs="Times New Roman"/>
+          <w:sz w:val="28"/>
+          <w:szCs w:val="28"/>
+        </w:rPr>
+      </w:pPr>
+      <w:r>
+        <w:rPr>
+          <w:rFonts w:ascii="Times New Roman" w:hAnsi="Times New Roman" w:cs="Times New Roman"/>
+          <w:b/>
+          <w:bCs/>
+          <w:sz w:val="28"/>
+          <w:szCs w:val="28"/>
+        </w:rPr>
+        <w:lastRenderedPageBreak/>
         <w:t>Adam Optimizer</w:t>
       </w:r>
       <w:r>
@@ -2078,7 +2114,6 @@
           <w:sz w:val="28"/>
           <w:szCs w:val="28"/>
         </w:rPr>
-        <w:lastRenderedPageBreak/>
         <w:t xml:space="preserve">Dice Loss ensures good overlap between predicted and actual </w:t>
       </w:r>
       <w:r>
@@ -2571,7 +2606,6 @@
           <w:sz w:val="28"/>
           <w:szCs w:val="28"/>
         </w:rPr>
-        <w:lastRenderedPageBreak/>
         <w:t>Dice Loss: 0.8059</w:t>
       </w:r>
     </w:p>
@@ -2769,7 +2803,7 @@
 </file>
 
 <file path=word/numbering.xml><?xml version="1.0" encoding="utf-8"?>
-<w:numbering xmlns:wpc="http://schemas.microsoft.com/office/word/2010/wordprocessingCanvas" xmlns:cx="http://schemas.microsoft.com/office/drawing/2014/chartex" xmlns:cx1="http://schemas.microsoft.com/office/drawing/2015/9/8/chartex" xmlns:cx2="http://schemas.microsoft.com/office/drawing/2015/10/21/chartex" xmlns:cx3="http://schemas.microsoft.com/office/drawing/2016/5/9/chartex" xmlns:cx4="http://schemas.microsoft.com/office/drawing/2016/5/10/chartex" xmlns:cx5="http://schemas.microsoft.com/office/drawing/2016/5/11/chartex" xmlns:cx6="http://schemas.microsoft.com/office/drawing/2016/5/12/chartex" xmlns:cx7="http://schemas.microsoft.com/office/drawing/2016/5/13/chartex" xmlns:cx8="http://schemas.microsoft.com/office/drawing/2016/5/14/chartex" xmlns:mc="http://schemas.openxmlformats.org/markup-compatibility/2006" xmlns:aink="http://schemas.microsoft.com/office/drawing/2016/ink" xmlns:am3d="http://schemas.microsoft.com/office/drawing/2017/model3d" xmlns:o="urn:schemas-microsoft-com:office:office" xmlns:oel="http://schemas.microsoft.com/office/2019/extlst" xmlns:r="http://schemas.openxmlformats.org/officeDocument/2006/relationships" xmlns:m="http://schemas.openxmlformats.org/officeDocument/2006/math" xmlns:v="urn:schemas-microsoft-com:vml" xmlns:wp14="http://schemas.microsoft.com/office/word/2010/wordprocessingDrawing" xmlns:wp="http://schemas.openxmlformats.org/drawingml/2006/wordprocessingDrawing" xmlns:w10="urn:schemas-microsoft-com:office:word" xmlns:w="http://schemas.openxmlformats.org/wordprocessingml/2006/main" xmlns:w14="http://schemas.microsoft.com/office/word/2010/wordml" xmlns:w15="http://schemas.microsoft.com/office/word/2012/wordml" xmlns:w16cex="http://schemas.microsoft.com/office/word/2018/wordml/cex" xmlns:w16cid="http://schemas.microsoft.com/office/word/2016/wordml/cid" xmlns:w16="http://schemas.microsoft.com/office/word/2018/wordml" xmlns:w16du="http://schemas.microsoft.com/office/word/2023/wordml/word16du" xmlns:w16sdtdh="http://schemas.microsoft.com/office/word/2020/wordml/sdtdatahash" xmlns:w16sdtfl="http://schemas.microsoft.com/office/word/2024/wordml/sdtformatlock" xmlns:w16se="http://schemas.microsoft.com/office/word/2015/wordml/symex" xmlns:wpg="http://schemas.microsoft.com/office/word/2010/wordprocessingGroup" xmlns:wpi="http://schemas.microsoft.com/office/word/2010/wordprocessingInk" xmlns:wne="http://schemas.microsoft.com/office/word/2006/wordml" xmlns:wps="http://schemas.microsoft.com/office/word/2010/wordprocessingShape" mc:Ignorable="w14 w15 w16se w16cid w16 w16cex w16sdtdh w16sdtfl w16du wp14">
+<w:numbering xmlns:wpc="http://schemas.microsoft.com/office/word/2010/wordprocessingCanvas" xmlns:cx="http://schemas.microsoft.com/office/drawing/2014/chartex" xmlns:cx1="http://schemas.microsoft.com/office/drawing/2015/9/8/chartex" xmlns:cx2="http://schemas.microsoft.com/office/drawing/2015/10/21/chartex" xmlns:cx3="http://schemas.microsoft.com/office/drawing/2016/5/9/chartex" xmlns:cx4="http://schemas.microsoft.com/office/drawing/2016/5/10/chartex" xmlns:cx5="http://schemas.microsoft.com/office/drawing/2016/5/11/chartex" xmlns:cx6="http://schemas.microsoft.com/office/drawing/2016/5/12/chartex" xmlns:cx7="http://schemas.microsoft.com/office/drawing/2016/5/13/chartex" xmlns:cx8="http://schemas.microsoft.com/office/drawing/2016/5/14/chartex" xmlns:mc="http://schemas.openxmlformats.org/markup-compatibility/2006" xmlns:aink="http://schemas.microsoft.com/office/drawing/2016/ink" xmlns:am3d="http://schemas.microsoft.com/office/drawing/2017/model3d" xmlns:o="urn:schemas-microsoft-com:office:office" xmlns:r="http://schemas.openxmlformats.org/officeDocument/2006/relationships" xmlns:m="http://schemas.openxmlformats.org/officeDocument/2006/math" xmlns:v="urn:schemas-microsoft-com:vml" xmlns:wp14="http://schemas.microsoft.com/office/word/2010/wordprocessingDrawing" xmlns:wp="http://schemas.openxmlformats.org/drawingml/2006/wordprocessingDrawing" xmlns:w10="urn:schemas-microsoft-com:office:word" xmlns:w="http://schemas.openxmlformats.org/wordprocessingml/2006/main" xmlns:w14="http://schemas.microsoft.com/office/word/2010/wordml" xmlns:w15="http://schemas.microsoft.com/office/word/2012/wordml" xmlns:w16cid="http://schemas.microsoft.com/office/word/2016/wordml/cid" xmlns:w16se="http://schemas.microsoft.com/office/word/2015/wordml/symex" xmlns:wpg="http://schemas.microsoft.com/office/word/2010/wordprocessingGroup" xmlns:wpi="http://schemas.microsoft.com/office/word/2010/wordprocessingInk" xmlns:wne="http://schemas.microsoft.com/office/word/2006/wordml" xmlns:wps="http://schemas.microsoft.com/office/word/2010/wordprocessingShape" mc:Ignorable="w14 w15 w16se w16cid wp14">
   <w:abstractNum w:abstractNumId="0" w15:restartNumberingAfterBreak="0">
     <w:nsid w:val="FFFFFF89"/>
     <w:multiLevelType w:val="singleLevel"/>
@@ -4132,41 +4166,41 @@
       </w:rPr>
     </w:lvl>
   </w:abstractNum>
-  <w:num w:numId="1" w16cid:durableId="377701130">
+  <w:num w:numId="1">
     <w:abstractNumId w:val="6"/>
   </w:num>
-  <w:num w:numId="2" w16cid:durableId="1800495666">
+  <w:num w:numId="2">
     <w:abstractNumId w:val="9"/>
   </w:num>
-  <w:num w:numId="3" w16cid:durableId="1852836451">
+  <w:num w:numId="3">
     <w:abstractNumId w:val="1"/>
   </w:num>
-  <w:num w:numId="4" w16cid:durableId="526333369">
+  <w:num w:numId="4">
     <w:abstractNumId w:val="0"/>
   </w:num>
-  <w:num w:numId="5" w16cid:durableId="959072384">
+  <w:num w:numId="5">
     <w:abstractNumId w:val="4"/>
   </w:num>
-  <w:num w:numId="6" w16cid:durableId="2117406316">
+  <w:num w:numId="6">
     <w:abstractNumId w:val="2"/>
   </w:num>
-  <w:num w:numId="7" w16cid:durableId="1713268965">
+  <w:num w:numId="7">
     <w:abstractNumId w:val="8"/>
   </w:num>
-  <w:num w:numId="8" w16cid:durableId="873689039">
+  <w:num w:numId="8">
     <w:abstractNumId w:val="7"/>
   </w:num>
-  <w:num w:numId="9" w16cid:durableId="150996056">
+  <w:num w:numId="9">
     <w:abstractNumId w:val="3"/>
   </w:num>
-  <w:num w:numId="10" w16cid:durableId="1953318910">
+  <w:num w:numId="10">
     <w:abstractNumId w:val="5"/>
   </w:num>
 </w:numbering>
 </file>
 
 <file path=word/styles.xml><?xml version="1.0" encoding="utf-8"?>
-<w:styles xmlns:mc="http://schemas.openxmlformats.org/markup-compatibility/2006" xmlns:r="http://schemas.openxmlformats.org/officeDocument/2006/relationships" xmlns:w="http://schemas.openxmlformats.org/wordprocessingml/2006/main" xmlns:w14="http://schemas.microsoft.com/office/word/2010/wordml" xmlns:w15="http://schemas.microsoft.com/office/word/2012/wordml" xmlns:w16cex="http://schemas.microsoft.com/office/word/2018/wordml/cex" xmlns:w16cid="http://schemas.microsoft.com/office/word/2016/wordml/cid" xmlns:w16="http://schemas.microsoft.com/office/word/2018/wordml" xmlns:w16du="http://schemas.microsoft.com/office/word/2023/wordml/word16du" xmlns:w16sdtdh="http://schemas.microsoft.com/office/word/2020/wordml/sdtdatahash" xmlns:w16sdtfl="http://schemas.microsoft.com/office/word/2024/wordml/sdtformatlock" xmlns:w16se="http://schemas.microsoft.com/office/word/2015/wordml/symex" mc:Ignorable="w14 w15 w16se w16cid w16 w16cex w16sdtdh w16sdtfl w16du">
+<w:styles xmlns:mc="http://schemas.openxmlformats.org/markup-compatibility/2006" xmlns:r="http://schemas.openxmlformats.org/officeDocument/2006/relationships" xmlns:w="http://schemas.openxmlformats.org/wordprocessingml/2006/main" xmlns:w14="http://schemas.microsoft.com/office/word/2010/wordml" xmlns:w15="http://schemas.microsoft.com/office/word/2012/wordml" xmlns:w16cid="http://schemas.microsoft.com/office/word/2016/wordml/cid" xmlns:w16se="http://schemas.microsoft.com/office/word/2015/wordml/symex" mc:Ignorable="w14 w15 w16se w16cid">
   <w:docDefaults>
     <w:rPrDefault>
       <w:rPr>
@@ -4184,7 +4218,7 @@
       </w:pPr>
     </w:pPrDefault>
   </w:docDefaults>
-  <w:latentStyles w:defLockedState="0" w:defUIPriority="99" w:defSemiHidden="0" w:defUnhideWhenUsed="0" w:defQFormat="0" w:count="376">
+  <w:latentStyles w:defLockedState="0" w:defUIPriority="99" w:defSemiHidden="0" w:defUnhideWhenUsed="0" w:defQFormat="0" w:count="375">
     <w:lsdException w:name="Normal" w:uiPriority="0" w:qFormat="1"/>
     <w:lsdException w:name="heading 1" w:uiPriority="9" w:qFormat="1"/>
     <w:lsdException w:name="heading 2" w:semiHidden="1" w:uiPriority="9" w:unhideWhenUsed="1" w:qFormat="1"/>
@@ -4560,7 +4594,6 @@
     <w:lsdException w:name="Smart Hyperlink" w:semiHidden="1" w:unhideWhenUsed="1"/>
     <w:lsdException w:name="Hashtag" w:semiHidden="1" w:unhideWhenUsed="1"/>
     <w:lsdException w:name="Unresolved Mention" w:semiHidden="1" w:unhideWhenUsed="1"/>
-    <w:lsdException w:name="Smart Link" w:semiHidden="1" w:unhideWhenUsed="1"/>
   </w:latentStyles>
   <w:style w:type="paragraph" w:default="1" w:styleId="Normal">
     <w:name w:val="Normal"/>
@@ -4768,6 +4801,7 @@
   <w:style w:type="character" w:default="1" w:styleId="DefaultParagraphFont">
     <w:name w:val="Default Paragraph Font"/>
     <w:uiPriority w:val="1"/>
+    <w:semiHidden/>
     <w:unhideWhenUsed/>
   </w:style>
   <w:style w:type="table" w:default="1" w:styleId="TableNormal">
@@ -5128,6 +5162,17 @@
       <w:contextualSpacing/>
     </w:pPr>
   </w:style>
+  <w:style w:type="character" w:styleId="Strong">
+    <w:name w:val="Strong"/>
+    <w:basedOn w:val="DefaultParagraphFont"/>
+    <w:uiPriority w:val="22"/>
+    <w:qFormat/>
+    <w:rsid w:val="002A6096"/>
+    <w:rPr>
+      <w:b/>
+      <w:bCs/>
+    </w:rPr>
+  </w:style>
 </w:styles>
 </file>
 

</xml_diff>